<commit_message>
feat: add consent to publish documents and update FRP report files
</commit_message>
<xml_diff>
--- a/SEM_8/FRP/FRP Report.docx
+++ b/SEM_8/FRP/FRP Report.docx
@@ -1686,7 +1686,7 @@
                 <w:vertAlign w:val="baseline"/>
                 <w:lang w:val="en-US"/>
               </w:rPr>
-              <w:t xml:space="preserve">Date: </w:t>
+              <w:t>Date: 01 June, 2026</w:t>
             </w:r>
           </w:p>
         </w:tc>
@@ -2532,7 +2532,21 @@
                 <w:vertAlign w:val="baseline"/>
                 <w:lang w:val="en-US"/>
               </w:rPr>
-              <w:t xml:space="preserve">Date: </w:t>
+              <w:t>Date: 01 June, 202</w:t>
+            </w:r>
+            <w:bookmarkStart w:id="0" w:name="_GoBack"/>
+            <w:bookmarkEnd w:id="0"/>
+            <w:r>
+              <w:rPr>
+                <w:rFonts w:hint="default" w:ascii="Times New Roman Bold" w:hAnsi="Times New Roman Bold" w:cs="Times New Roman Bold"/>
+                <w:b/>
+                <w:bCs/>
+                <w:sz w:val="24"/>
+                <w:szCs w:val="24"/>
+                <w:vertAlign w:val="baseline"/>
+                <w:lang w:val="en-US"/>
+              </w:rPr>
+              <w:t>6</w:t>
             </w:r>
           </w:p>
         </w:tc>
@@ -17849,20 +17863,7 @@
           <w:szCs w:val="24"/>
           <w:lang w:val="en-US" w:eastAsia="zh-CN" w:bidi="ar"/>
         </w:rPr>
-        <w:t>Li, J. et al. (2025) 'Steering Large Language Models for Vulnerability Detection', 2025 IEEE International Conference on Acoustics, Speech and Signal Processing (ICASSP</w:t>
-      </w:r>
-      <w:bookmarkStart w:id="0" w:name="_GoBack"/>
-      <w:bookmarkEnd w:id="0"/>
-      <w:r>
-        <w:rPr>
-          <w:rFonts w:hint="default" w:ascii="Times New Roman" w:hAnsi="Times New Roman" w:eastAsia="SimSun" w:cs="Times New Roman"/>
-          <w:color w:val="00000A"/>
-          <w:kern w:val="0"/>
-          <w:sz w:val="24"/>
-          <w:szCs w:val="24"/>
-          <w:lang w:val="en-US" w:eastAsia="zh-CN" w:bidi="ar"/>
-        </w:rPr>
-        <w:t xml:space="preserve">). </w:t>
+        <w:t xml:space="preserve">Li, J. et al. (2025) 'Steering Large Language Models for Vulnerability Detection', 2025 IEEE International Conference on Acoustics, Speech and Signal Processing (ICASSP). </w:t>
       </w:r>
     </w:p>
     <w:p>
@@ -21035,6 +21036,7 @@
     <w:p>
       <w:pPr>
         <w:numPr>
+          <w:ilvl w:val="0"/>
           <w:numId w:val="0"/>
         </w:numPr>
         <w:spacing w:after="0" w:line="360" w:lineRule="auto"/>
@@ -21100,6 +21102,7 @@
     <w:p>
       <w:pPr>
         <w:numPr>
+          <w:ilvl w:val="0"/>
           <w:numId w:val="0"/>
         </w:numPr>
         <w:spacing w:after="0" w:line="360" w:lineRule="auto"/>
@@ -21165,6 +21168,7 @@
     <w:p>
       <w:pPr>
         <w:numPr>
+          <w:ilvl w:val="0"/>
           <w:numId w:val="0"/>
         </w:numPr>
         <w:spacing w:after="0" w:line="360" w:lineRule="auto"/>
@@ -21230,6 +21234,7 @@
     <w:p>
       <w:pPr>
         <w:numPr>
+          <w:ilvl w:val="0"/>
           <w:numId w:val="0"/>
         </w:numPr>
         <w:spacing w:after="0" w:line="360" w:lineRule="auto"/>
@@ -21295,6 +21300,7 @@
     <w:p>
       <w:pPr>
         <w:numPr>
+          <w:ilvl w:val="0"/>
           <w:numId w:val="0"/>
         </w:numPr>
         <w:spacing w:after="0" w:line="360" w:lineRule="auto"/>
@@ -21360,6 +21366,7 @@
     <w:p>
       <w:pPr>
         <w:numPr>
+          <w:ilvl w:val="0"/>
           <w:numId w:val="0"/>
         </w:numPr>
         <w:spacing w:after="0" w:line="360" w:lineRule="auto"/>

</xml_diff>